<commit_message>
Align savings payment and mock server with backend v6.2
- Savings installment payment keeps login password + account PIN (v6.2 contract)
- Mock: PIN transfer approval not blocked by settings password lockout,
  savings join 30/min limit, payment requires password again
- Update change request document for v6.2

Co-Authored-By: Claude Opus 5.5 <noreply@anthropic.com>
</commit_message>
<xml_diff>
--- a/frontend/docs/변경 요청 정리.docx
+++ b/frontend/docs/변경 요청 정리.docx
@@ -20,7 +20,7 @@
           <w:sz w:val="19"/>
           <w:szCs w:val="19"/>
         </w:rPr>
-        <w:t xml:space="preserve">2026-10-04 · 로컬 통합 테스트 중 요청한 변경 사항</w:t>
+        <w:t xml:space="preserve">2026-10-04 작성, 2026-10-05 갱신(백엔드 v6.2 반영) · 로컬 통합 테스트 중 요청한 변경 사항</w:t>
       </w:r>
     </w:p>
     <w:p>
@@ -508,7 +508,7 @@
                 <w:sz w:val="18"/>
                 <w:szCs w:val="18"/>
               </w:rPr>
-              <w:t xml:space="preserve">필요 (백엔드 수정 예정)</w:t>
+              <w:t xml:space="preserve">필요 → v6.2 반영 완료</w:t>
             </w:r>
           </w:p>
         </w:tc>
@@ -908,7 +908,7 @@
                 <w:sz w:val="18"/>
                 <w:szCs w:val="18"/>
               </w:rPr>
-              <w:t xml:space="preserve">예금·적금 가입·적금 납입 시 로그인 비밀번호 제외, 계좌 비밀번호(PIN)만 입력</w:t>
+              <w:t xml:space="preserve">예금·적금 가입 시 로그인 비밀번호 제외, 계좌 비밀번호(PIN)만 입력 (적금 추가 납입은 백엔드 v6.2 기준에 맞춰 로그인 비밀번호 + PIN 유지)</w:t>
             </w:r>
           </w:p>
         </w:tc>
@@ -936,7 +936,7 @@
                 <w:sz w:val="18"/>
                 <w:szCs w:val="18"/>
               </w:rPr>
-              <w:t xml:space="preserve">상품 가입, 예적금 상세(납입)</w:t>
+              <w:t xml:space="preserve">상품 가입</w:t>
             </w:r>
           </w:p>
         </w:tc>
@@ -965,7 +965,7 @@
                 <w:sz w:val="18"/>
                 <w:szCs w:val="18"/>
               </w:rPr>
-              <w:t xml:space="preserve">필요 (백엔드에 함께 전달)</w:t>
+              <w:t xml:space="preserve">필요 → v6.2 반영 완료</w:t>
             </w:r>
           </w:p>
         </w:tc>
@@ -1374,7 +1374,7 @@
         <w:spacing w:after="120"/>
       </w:pPr>
       <w:r>
-        <w:t xml:space="preserve">• 3번·7번은 백엔드가 같은 내용으로 수정해야 실서버에서 동작함 (그 전에는 목 모드에서만 동작)</w:t>
+        <w:t xml:space="preserve">• 3번·7번은 백엔드 v6.2(2026-10-05)에서 반영됨. v6.2 실서버와 목 모드에서 함께 확인 완료</w:t>
       </w:r>
     </w:p>
     <w:p>
@@ -1382,7 +1382,15 @@
         <w:spacing w:after="120"/>
       </w:pPr>
       <w:r>
-        <w:t xml:space="preserve">• 예금·적금 해지는 계속 로그인 비밀번호를 받음</w:t>
+        <w:t xml:space="preserve">• 적금 추가 납입은 PIN만 받도록 바꿨다가, 백엔드 v6.2가 로그인 비밀번호 + PIN을 유지해 프론트를 다시 맞춤</w:t>
+      </w:r>
+    </w:p>
+    <w:p>
+      <w:pPr>
+        <w:spacing w:after="120"/>
+      </w:pPr>
+      <w:r>
+        <w:t xml:space="preserve">• 예금·적금 해지와 보안 설정 변경(출금 등록·계좌 비밀번호 변경·이체한도 감액)은 계속 로그인 비밀번호를 받음</w:t>
       </w:r>
     </w:p>
     <w:sectPr>

</xml_diff>